<commit_message>
Resolve open decisions, add /session-end skill, ship resource hub v1
Confirms name (final), grade range, and cost (free); leaves Showcase
format open. Adds a per-week resource hub scaffold: Chart/Chord
Chart/Reference Track URL columns on the song library, joined to the
schedule by a new Song Title column, rendered as a Resources column
on both the Schedule and Song Library tables (falls back to "Coming
soon" until a leader fills in a URL). Also adds the /session-end
skill this workflow itself uses.

Co-Authored-By: Claude Sonnet 5 <noreply@anthropic.com>
</commit_message>
<xml_diff>
--- a/deliverables/Worship Music School - Program Plan.docx
+++ b/deliverables/Worship Music School - Program Plan.docx
@@ -1651,7 +1651,7 @@
           <w:sz w:val="22"/>
           <w:szCs w:val="22"/>
         </w:rPr>
-        <w:t xml:space="preserve">This plan was drafted from the initial brief; the meeting night/time is now locked, and a few other parameters remain assumed and easy to adjust — none of them change the structure, only the specifics:</w:t>
+        <w:t xml:space="preserve">This plan was drafted from the initial brief; several parameters are now locked, and a couple remain assumed and easy to adjust — none of them change the structure, only the specifics:</w:t>
       </w:r>
     </w:p>
     <w:p>
@@ -1669,25 +1669,7 @@
           <w:sz w:val="22"/>
           <w:szCs w:val="22"/>
         </w:rPr>
-        <w:t xml:space="preserve">Meeting night/time: confirmed — Sunday evenings, ~60 minutes, starting Sept 6.</w:t>
-      </w:r>
-    </w:p>
-    <w:p>
-      <w:pPr>
-        <w:pStyle w:val="ListParagraph"/>
-        <w:numPr>
-          <w:ilvl w:val="0"/>
-          <w:numId w:val="1"/>
-        </w:numPr>
-        <w:spacing w:after="80" w:line="276"/>
-      </w:pPr>
-      <w:r>
-        <w:rPr>
-          <w:rFonts w:ascii="Calibri" w:cs="Calibri" w:eastAsia="Calibri" w:hAnsi="Calibri"/>
-          <w:sz w:val="22"/>
-          <w:szCs w:val="22"/>
-        </w:rPr>
-        <w:t xml:space="preserve">Ages: middle + high school (~12–18).</w:t>
+        <w:t xml:space="preserve">Confirmed: name (Worship Music School, final), meeting night/time (Sunday evenings, ~60 minutes, starting Sept 6), grade range (middle + high school, ~12–18, all levels), and cost (free to families).</w:t>
       </w:r>
     </w:p>
     <w:p>

</xml_diff>